<commit_message>
docs(kt05): align functional testing documentation with teacher requirements
Co-authored-by: Cursor <cursoragent@cursor.com>
</commit_message>
<xml_diff>
--- a/reports/KT05.docx
+++ b/reports/KT05.docx
@@ -162,7 +162,7 @@
           <w:b/>
           <w:sz w:val="28"/>
         </w:rPr>
-        <w:t>2. Сайт</w:t>
+        <w:t>2. Обоснование выбора сайта</w:t>
       </w:r>
     </w:p>
     <w:p>
@@ -175,7 +175,7 @@
           <w:b w:val="0"/>
           <w:sz w:val="24"/>
         </w:rPr>
-        <w:t>URL: https://vdnh.ru/news/</w:t>
+        <w:t>URL: https://vdnh.ru/ и https://vdnh.ru/news/</w:t>
       </w:r>
     </w:p>
     <w:p>
@@ -188,7 +188,20 @@
           <w:b w:val="0"/>
           <w:sz w:val="24"/>
         </w:rPr>
-        <w:t>Для стабильного запуска использовались pageLoadStrategy=none, явные ожидания и прогон без VPN (scripts/run_kt05_no_vpn.ps1).</w:t>
+        <w:t>Выбран публичный информационный портал ВДНХ: read-only сценарии без регистрации, реальная лента новостей с подгрузкой, достаточная сложность для Page Object, этичные ограничения (без нагрузки). Подробнее: docs/kt05/website-selection.md.</w:t>
+      </w:r>
+    </w:p>
+    <w:p>
+      <w:pPr>
+        <w:spacing w:after="120" w:line="276" w:lineRule="auto"/>
+      </w:pPr>
+      <w:r>
+        <w:rPr>
+          <w:rFonts w:ascii="Times New Roman" w:hAnsi="Times New Roman" w:eastAsia="Times New Roman"/>
+          <w:b w:val="0"/>
+          <w:sz w:val="24"/>
+        </w:rPr>
+        <w:t>Бизнес-назначение: информирование посетителей о событиях; критичны доступность ленты, кликабельность карточек, читаемость статей и подгрузка «Показать ещё».</w:t>
       </w:r>
     </w:p>
     <w:p>
@@ -214,7 +227,20 @@
           <w:b w:val="0"/>
           <w:sz w:val="24"/>
         </w:rPr>
-        <w:t>Windows 11; Python 3.13.9; pytest 8.4.2; Selenium 4.50.0; Chrome headed.</w:t>
+        <w:t>Windows; Python 3.13; pytest 8.4.2; Selenium 4.50.0; Chrome headed.</w:t>
+      </w:r>
+    </w:p>
+    <w:p>
+      <w:pPr>
+        <w:spacing w:after="120" w:line="276" w:lineRule="auto"/>
+      </w:pPr>
+      <w:r>
+        <w:rPr>
+          <w:rFonts w:ascii="Times New Roman" w:hAnsi="Times New Roman" w:eastAsia="Times New Roman"/>
+          <w:b w:val="0"/>
+          <w:sz w:val="24"/>
+        </w:rPr>
+        <w:t>pageLoadStrategy=none + DOM waits; запуск без VPN: scripts/run_kt05_no_vpn.ps1.</w:t>
       </w:r>
     </w:p>
     <w:p>
@@ -232,6 +258,19 @@
     </w:p>
     <w:p>
       <w:pPr>
+        <w:pStyle w:val="Heading1"/>
+      </w:pPr>
+      <w:r>
+        <w:rPr>
+          <w:rFonts w:ascii="Times New Roman" w:hAnsi="Times New Roman" w:eastAsia="Times New Roman"/>
+          <w:b/>
+          <w:sz w:val="28"/>
+        </w:rPr>
+        <w:t>4. Методика и критерии</w:t>
+      </w:r>
+    </w:p>
+    <w:p>
+      <w:pPr>
         <w:spacing w:after="120" w:line="276" w:lineRule="auto"/>
       </w:pPr>
       <w:r>
@@ -240,7 +279,59 @@
           <w:b w:val="0"/>
           <w:sz w:val="24"/>
         </w:rPr>
-        <w:t>Документация: docs/kt05/.</w:t>
+        <w:t>Black-box — пользовательские сценарии. Gray-box — DOM/CSS/URL/readyState.</w:t>
+      </w:r>
+    </w:p>
+    <w:p>
+      <w:pPr>
+        <w:spacing w:after="120" w:line="276" w:lineRule="auto"/>
+      </w:pPr>
+      <w:r>
+        <w:rPr>
+          <w:rFonts w:ascii="Times New Roman" w:hAnsi="Times New Roman" w:eastAsia="Times New Roman"/>
+          <w:b w:val="0"/>
+          <w:sz w:val="24"/>
+        </w:rPr>
+        <w:t>White-box backend: не применим (закрытый сервер VDNH).</w:t>
+      </w:r>
+    </w:p>
+    <w:p>
+      <w:pPr>
+        <w:spacing w:after="120" w:line="276" w:lineRule="auto"/>
+      </w:pPr>
+      <w:r>
+        <w:rPr>
+          <w:rFonts w:ascii="Times New Roman" w:hAnsi="Times New Roman" w:eastAsia="Times New Roman"/>
+          <w:b w:val="0"/>
+          <w:sz w:val="24"/>
+        </w:rPr>
+        <w:t>Risk-based: P0 лента/статья; P1 show_more; P2 logo/menu.</w:t>
+      </w:r>
+    </w:p>
+    <w:p>
+      <w:pPr>
+        <w:spacing w:after="120" w:line="276" w:lineRule="auto"/>
+      </w:pPr>
+      <w:r>
+        <w:rPr>
+          <w:rFonts w:ascii="Times New Roman" w:hAnsi="Times New Roman" w:eastAsia="Times New Roman"/>
+          <w:b w:val="0"/>
+          <w:sz w:val="24"/>
+        </w:rPr>
+        <w:t>Вход: Chrome, venv, сайт доступен. Выход: ≥8 автотестов, docs/kt05/, DOCX, честные результаты.</w:t>
+      </w:r>
+    </w:p>
+    <w:p>
+      <w:pPr>
+        <w:spacing w:after="120" w:line="276" w:lineRule="auto"/>
+      </w:pPr>
+      <w:r>
+        <w:rPr>
+          <w:rFonts w:ascii="Times New Roman" w:hAnsi="Times New Roman" w:eastAsia="Times New Roman"/>
+          <w:b w:val="0"/>
+          <w:sz w:val="24"/>
+        </w:rPr>
+        <w:t>Подробный план: docs/kt05/test-plan.md.</w:t>
       </w:r>
     </w:p>
     <w:p>
@@ -253,7 +344,7 @@
           <w:b/>
           <w:sz w:val="28"/>
         </w:rPr>
-        <w:t>4. Методика</w:t>
+        <w:t>5. Трассируемость требований преподавателя</w:t>
       </w:r>
     </w:p>
     <w:p>
@@ -266,20 +357,7 @@
           <w:b w:val="0"/>
           <w:sz w:val="24"/>
         </w:rPr>
-        <w:t>Чёрный ящик — сценарии пользователя. Серый ящик — DOM/URL. Белый ящик backend не применялся.</w:t>
-      </w:r>
-    </w:p>
-    <w:p>
-      <w:pPr>
-        <w:pStyle w:val="Heading1"/>
-      </w:pPr>
-      <w:r>
-        <w:rPr>
-          <w:rFonts w:ascii="Times New Roman" w:hAnsi="Times New Roman" w:eastAsia="Times New Roman"/>
-          <w:b/>
-          <w:sz w:val="28"/>
-        </w:rPr>
-        <w:t>5. Кратко о тест-плане</w:t>
+        <w:t>1) Выбор сайта — website-selection.md / §2. 2) Подходы black/gray/white — §4.</w:t>
       </w:r>
     </w:p>
     <w:p>
@@ -292,7 +370,7 @@
           <w:b w:val="0"/>
           <w:sz w:val="24"/>
         </w:rPr>
-        <w:t>Scope: главная, /news/, карточки, статья, возврат, «Показать еще», меню/логотип.</w:t>
+        <w:t>3) Scope + entry/exit — test-plan.md. 4) Сценарии — test-cases.md + таблица ниже.</w:t>
       </w:r>
     </w:p>
     <w:p>
@@ -305,7 +383,20 @@
           <w:b w:val="0"/>
           <w:sz w:val="24"/>
         </w:rPr>
-        <w:t>Подробности: docs/kt05/test-plan.md.</w:t>
+        <w:t>5) Исполнение — §7. 6) Дефекты — §8 / defect-analysis.md (баг сайта не подтверждён).</w:t>
+      </w:r>
+    </w:p>
+    <w:p>
+      <w:pPr>
+        <w:spacing w:after="120" w:line="276" w:lineRule="auto"/>
+      </w:pPr>
+      <w:r>
+        <w:rPr>
+          <w:rFonts w:ascii="Times New Roman" w:hAnsi="Times New Roman" w:eastAsia="Times New Roman"/>
+          <w:b w:val="0"/>
+          <w:sz w:val="24"/>
+        </w:rPr>
+        <w:t>7) Рекомендации — §11. 8) Итоговый отчёт — данный DOCX.</w:t>
       </w:r>
     </w:p>
     <w:p>
@@ -1457,7 +1548,7 @@
           <w:b/>
           <w:sz w:val="28"/>
         </w:rPr>
-        <w:t>11. Заключение</w:t>
+        <w:t>11. Рекомендации</w:t>
       </w:r>
     </w:p>
     <w:p>
@@ -1470,7 +1561,46 @@
           <w:b w:val="0"/>
           <w:sz w:val="24"/>
         </w:rPr>
-        <w:t>КТ 05 завершена: 10 функциональных автотестов на https://vdnh.ru/news/, Page Object, документация docs/kt05/, offline-скрипты запуска. Полный прогон: 9 PASS / 1 FAIL. Сценарий «Показать еще» дополнительно подтверждён целевым PASS (11.60 с). Отчёт не подменяет два прогона одним успешным 10/10.</w:t>
+        <w:t>Продукт: подтверждённых дефектов раздела новостей нет.</w:t>
+      </w:r>
+    </w:p>
+    <w:p>
+      <w:pPr>
+        <w:spacing w:after="120" w:line="276" w:lineRule="auto"/>
+      </w:pPr>
+      <w:r>
+        <w:rPr>
+          <w:rFonts w:ascii="Times New Roman" w:hAnsi="Times New Roman" w:eastAsia="Times New Roman"/>
+          <w:b w:val="0"/>
+          <w:sz w:val="24"/>
+        </w:rPr>
+        <w:t>Процесс: не склеивать полный и follow-up прогоны; составные условия успеха подгрузки; data-testid на динамических кнопках желательны на стороне сайта; локаторы перепроверять при смене вёрстки. См. docs/kt05/recommendations.md.</w:t>
+      </w:r>
+    </w:p>
+    <w:p>
+      <w:pPr>
+        <w:pStyle w:val="Heading1"/>
+      </w:pPr>
+      <w:r>
+        <w:rPr>
+          <w:rFonts w:ascii="Times New Roman" w:hAnsi="Times New Roman" w:eastAsia="Times New Roman"/>
+          <w:b/>
+          <w:sz w:val="28"/>
+        </w:rPr>
+        <w:t>12. Заключение</w:t>
+      </w:r>
+    </w:p>
+    <w:p>
+      <w:pPr>
+        <w:spacing w:after="120" w:line="276" w:lineRule="auto"/>
+      </w:pPr>
+      <w:r>
+        <w:rPr>
+          <w:rFonts w:ascii="Times New Roman" w:hAnsi="Times New Roman" w:eastAsia="Times New Roman"/>
+          <w:b w:val="0"/>
+          <w:sz w:val="24"/>
+        </w:rPr>
+        <w:t>КТ 05: 10 функциональных автотестов на https://vdnh.ru/news/, Page Object, расширенная документация (выбор сайта, методика, дефекты, рекомендации). Полный прогон: 9 PASS / 1 FAIL. Show_more подтверждён отдельно PASS (11.60 с). Единого прогона 10/10 не было. Дефект сайта не подтверждён.</w:t>
       </w:r>
     </w:p>
     <w:sectPr>

</xml_diff>

<commit_message>
docs(kt05): complete functional testing analysis and documentation
Record remediation full suite 10 PASS / 50.63s while preserving historical 9/1 and follow-up runs.

Co-authored-by: Cursor <cursoragent@cursor.com>
</commit_message>
<xml_diff>
--- a/reports/KT05.docx
+++ b/reports/KT05.docx
@@ -123,7 +123,7 @@
           <w:b w:val="0"/>
           <w:sz w:val="24"/>
         </w:rPr>
-        <w:t>Дата: 2026-10-09</w:t>
+        <w:t>Дата обновления отчёта: 2026-10-11</w:t>
       </w:r>
     </w:p>
     <w:p>
@@ -401,6 +401,19 @@
     </w:p>
     <w:p>
       <w:pPr>
+        <w:spacing w:after="120" w:line="276" w:lineRule="auto"/>
+      </w:pPr>
+      <w:r>
+        <w:rPr>
+          <w:rFonts w:ascii="Times New Roman" w:hAnsi="Times New Roman" w:eastAsia="Times New Roman"/>
+          <w:b w:val="0"/>
+          <w:sz w:val="24"/>
+        </w:rPr>
+        <w:t>Матрица: docs/kt05/requirements-traceability.md.</w:t>
+      </w:r>
+    </w:p>
+    <w:p>
+      <w:pPr>
         <w:pStyle w:val="Heading1"/>
       </w:pPr>
       <w:r>
@@ -409,7 +422,7 @@
           <w:b/>
           <w:sz w:val="28"/>
         </w:rPr>
-        <w:t>6. Таблица тест-кейсов (два прогона)</w:t>
+        <w:t>6. Таблица тест-кейсов (три прогона)</w:t>
       </w:r>
     </w:p>
     <w:p>
@@ -422,7 +435,7 @@
           <w:b/>
           <w:sz w:val="24"/>
         </w:rPr>
-        <w:t>Внимание: ниже — результаты двух отдельных запусков. Единого прогона «10/10 PASS» не было.</w:t>
+        <w:t>Внимание: прогоны №1–№2 (2026-10-09) — отдельные исторические запуски и не склеиваются в «один 10/10». Прогон №3 (2026-10-11) — новый полный suite.</w:t>
       </w:r>
     </w:p>
     <w:tbl>
@@ -432,15 +445,16 @@
         <w:tblLook w:firstColumn="1" w:firstRow="1" w:lastColumn="0" w:lastRow="0" w:noHBand="0" w:noVBand="1" w:val="04A0"/>
       </w:tblPr>
       <w:tblGrid>
-        <w:gridCol w:w="2493"/>
-        <w:gridCol w:w="2493"/>
-        <w:gridCol w:w="2493"/>
-        <w:gridCol w:w="2493"/>
+        <w:gridCol w:w="1995"/>
+        <w:gridCol w:w="1995"/>
+        <w:gridCol w:w="1995"/>
+        <w:gridCol w:w="1995"/>
+        <w:gridCol w:w="1995"/>
       </w:tblGrid>
       <w:tr>
         <w:tc>
           <w:tcPr>
-            <w:tcW w:type="dxa" w:w="2493"/>
+            <w:tcW w:type="dxa" w:w="1995"/>
           </w:tcPr>
           <w:p>
             <w:r>
@@ -450,7 +464,7 @@
         </w:tc>
         <w:tc>
           <w:tcPr>
-            <w:tcW w:type="dxa" w:w="2493"/>
+            <w:tcW w:type="dxa" w:w="1995"/>
           </w:tcPr>
           <w:p>
             <w:r>
@@ -460,21 +474,31 @@
         </w:tc>
         <w:tc>
           <w:tcPr>
-            <w:tcW w:type="dxa" w:w="2493"/>
+            <w:tcW w:type="dxa" w:w="1995"/>
           </w:tcPr>
           <w:p>
             <w:r>
-              <w:t>Прогон №1 (полный)</w:t>
+              <w:t>№1 полный</w:t>
             </w:r>
           </w:p>
         </w:tc>
         <w:tc>
           <w:tcPr>
-            <w:tcW w:type="dxa" w:w="2493"/>
+            <w:tcW w:type="dxa" w:w="1995"/>
           </w:tcPr>
           <w:p>
             <w:r>
-              <w:t>Прогон №2 (show_more)</w:t>
+              <w:t>№2 show_more</w:t>
+            </w:r>
+          </w:p>
+        </w:tc>
+        <w:tc>
+          <w:tcPr>
+            <w:tcW w:type="dxa" w:w="1995"/>
+          </w:tcPr>
+          <w:p>
+            <w:r>
+              <w:t>№3 полный</w:t>
             </w:r>
           </w:p>
         </w:tc>
@@ -482,7 +506,7 @@
       <w:tr>
         <w:tc>
           <w:tcPr>
-            <w:tcW w:type="dxa" w:w="2493"/>
+            <w:tcW w:type="dxa" w:w="1995"/>
           </w:tcPr>
           <w:p>
             <w:r>
@@ -492,7 +516,7 @@
         </w:tc>
         <w:tc>
           <w:tcPr>
-            <w:tcW w:type="dxa" w:w="2493"/>
+            <w:tcW w:type="dxa" w:w="1995"/>
           </w:tcPr>
           <w:p>
             <w:r>
@@ -502,7 +526,7 @@
         </w:tc>
         <w:tc>
           <w:tcPr>
-            <w:tcW w:type="dxa" w:w="2493"/>
+            <w:tcW w:type="dxa" w:w="1995"/>
           </w:tcPr>
           <w:p>
             <w:r>
@@ -512,7 +536,7 @@
         </w:tc>
         <w:tc>
           <w:tcPr>
-            <w:tcW w:type="dxa" w:w="2493"/>
+            <w:tcW w:type="dxa" w:w="1995"/>
           </w:tcPr>
           <w:p>
             <w:r>
@@ -520,335 +544,9 @@
             </w:r>
           </w:p>
         </w:tc>
-      </w:tr>
-      <w:tr>
         <w:tc>
           <w:tcPr>
-            <w:tcW w:type="dxa" w:w="2493"/>
-          </w:tcPr>
-          <w:p>
-            <w:r>
-              <w:t>TC-05-02</w:t>
-            </w:r>
-          </w:p>
-        </w:tc>
-        <w:tc>
-          <w:tcPr>
-            <w:tcW w:type="dxa" w:w="2493"/>
-          </w:tcPr>
-          <w:p>
-            <w:r>
-              <w:t>test_news_section_loads</w:t>
-            </w:r>
-          </w:p>
-        </w:tc>
-        <w:tc>
-          <w:tcPr>
-            <w:tcW w:type="dxa" w:w="2493"/>
-          </w:tcPr>
-          <w:p>
-            <w:r>
-              <w:t>PASS</w:t>
-            </w:r>
-          </w:p>
-        </w:tc>
-        <w:tc>
-          <w:tcPr>
-            <w:tcW w:type="dxa" w:w="2493"/>
-          </w:tcPr>
-          <w:p>
-            <w:r>
-              <w:t>—</w:t>
-            </w:r>
-          </w:p>
-        </w:tc>
-      </w:tr>
-      <w:tr>
-        <w:tc>
-          <w:tcPr>
-            <w:tcW w:type="dxa" w:w="2493"/>
-          </w:tcPr>
-          <w:p>
-            <w:r>
-              <w:t>TC-05-03</w:t>
-            </w:r>
-          </w:p>
-        </w:tc>
-        <w:tc>
-          <w:tcPr>
-            <w:tcW w:type="dxa" w:w="2493"/>
-          </w:tcPr>
-          <w:p>
-            <w:r>
-              <w:t>test_news_heading_visible</w:t>
-            </w:r>
-          </w:p>
-        </w:tc>
-        <w:tc>
-          <w:tcPr>
-            <w:tcW w:type="dxa" w:w="2493"/>
-          </w:tcPr>
-          <w:p>
-            <w:r>
-              <w:t>PASS</w:t>
-            </w:r>
-          </w:p>
-        </w:tc>
-        <w:tc>
-          <w:tcPr>
-            <w:tcW w:type="dxa" w:w="2493"/>
-          </w:tcPr>
-          <w:p>
-            <w:r>
-              <w:t>—</w:t>
-            </w:r>
-          </w:p>
-        </w:tc>
-      </w:tr>
-      <w:tr>
-        <w:tc>
-          <w:tcPr>
-            <w:tcW w:type="dxa" w:w="2493"/>
-          </w:tcPr>
-          <w:p>
-            <w:r>
-              <w:t>TC-05-04</w:t>
-            </w:r>
-          </w:p>
-        </w:tc>
-        <w:tc>
-          <w:tcPr>
-            <w:tcW w:type="dxa" w:w="2493"/>
-          </w:tcPr>
-          <w:p>
-            <w:r>
-              <w:t>test_news_cards_have_meaningful_content</w:t>
-            </w:r>
-          </w:p>
-        </w:tc>
-        <w:tc>
-          <w:tcPr>
-            <w:tcW w:type="dxa" w:w="2493"/>
-          </w:tcPr>
-          <w:p>
-            <w:r>
-              <w:t>PASS</w:t>
-            </w:r>
-          </w:p>
-        </w:tc>
-        <w:tc>
-          <w:tcPr>
-            <w:tcW w:type="dxa" w:w="2493"/>
-          </w:tcPr>
-          <w:p>
-            <w:r>
-              <w:t>—</w:t>
-            </w:r>
-          </w:p>
-        </w:tc>
-      </w:tr>
-      <w:tr>
-        <w:tc>
-          <w:tcPr>
-            <w:tcW w:type="dxa" w:w="2493"/>
-          </w:tcPr>
-          <w:p>
-            <w:r>
-              <w:t>TC-05-05</w:t>
-            </w:r>
-          </w:p>
-        </w:tc>
-        <w:tc>
-          <w:tcPr>
-            <w:tcW w:type="dxa" w:w="2493"/>
-          </w:tcPr>
-          <w:p>
-            <w:r>
-              <w:t>test_news_cards_have_distinct_article_links</w:t>
-            </w:r>
-          </w:p>
-        </w:tc>
-        <w:tc>
-          <w:tcPr>
-            <w:tcW w:type="dxa" w:w="2493"/>
-          </w:tcPr>
-          <w:p>
-            <w:r>
-              <w:t>PASS</w:t>
-            </w:r>
-          </w:p>
-        </w:tc>
-        <w:tc>
-          <w:tcPr>
-            <w:tcW w:type="dxa" w:w="2493"/>
-          </w:tcPr>
-          <w:p>
-            <w:r>
-              <w:t>—</w:t>
-            </w:r>
-          </w:p>
-        </w:tc>
-      </w:tr>
-      <w:tr>
-        <w:tc>
-          <w:tcPr>
-            <w:tcW w:type="dxa" w:w="2493"/>
-          </w:tcPr>
-          <w:p>
-            <w:r>
-              <w:t>TC-05-06</w:t>
-            </w:r>
-          </w:p>
-        </w:tc>
-        <w:tc>
-          <w:tcPr>
-            <w:tcW w:type="dxa" w:w="2493"/>
-          </w:tcPr>
-          <w:p>
-            <w:r>
-              <w:t>test_open_article_from_card</w:t>
-            </w:r>
-          </w:p>
-        </w:tc>
-        <w:tc>
-          <w:tcPr>
-            <w:tcW w:type="dxa" w:w="2493"/>
-          </w:tcPr>
-          <w:p>
-            <w:r>
-              <w:t>PASS</w:t>
-            </w:r>
-          </w:p>
-        </w:tc>
-        <w:tc>
-          <w:tcPr>
-            <w:tcW w:type="dxa" w:w="2493"/>
-          </w:tcPr>
-          <w:p>
-            <w:r>
-              <w:t>—</w:t>
-            </w:r>
-          </w:p>
-        </w:tc>
-      </w:tr>
-      <w:tr>
-        <w:tc>
-          <w:tcPr>
-            <w:tcW w:type="dxa" w:w="2493"/>
-          </w:tcPr>
-          <w:p>
-            <w:r>
-              <w:t>TC-05-07</w:t>
-            </w:r>
-          </w:p>
-        </w:tc>
-        <w:tc>
-          <w:tcPr>
-            <w:tcW w:type="dxa" w:w="2493"/>
-          </w:tcPr>
-          <w:p>
-            <w:r>
-              <w:t>test_article_heading_and_details</w:t>
-            </w:r>
-          </w:p>
-        </w:tc>
-        <w:tc>
-          <w:tcPr>
-            <w:tcW w:type="dxa" w:w="2493"/>
-          </w:tcPr>
-          <w:p>
-            <w:r>
-              <w:t>PASS</w:t>
-            </w:r>
-          </w:p>
-        </w:tc>
-        <w:tc>
-          <w:tcPr>
-            <w:tcW w:type="dxa" w:w="2493"/>
-          </w:tcPr>
-          <w:p>
-            <w:r>
-              <w:t>—</w:t>
-            </w:r>
-          </w:p>
-        </w:tc>
-      </w:tr>
-      <w:tr>
-        <w:tc>
-          <w:tcPr>
-            <w:tcW w:type="dxa" w:w="2493"/>
-          </w:tcPr>
-          <w:p>
-            <w:r>
-              <w:t>TC-05-08</w:t>
-            </w:r>
-          </w:p>
-        </w:tc>
-        <w:tc>
-          <w:tcPr>
-            <w:tcW w:type="dxa" w:w="2493"/>
-          </w:tcPr>
-          <w:p>
-            <w:r>
-              <w:t>test_navigate_back_to_news_section</w:t>
-            </w:r>
-          </w:p>
-        </w:tc>
-        <w:tc>
-          <w:tcPr>
-            <w:tcW w:type="dxa" w:w="2493"/>
-          </w:tcPr>
-          <w:p>
-            <w:r>
-              <w:t>PASS</w:t>
-            </w:r>
-          </w:p>
-        </w:tc>
-        <w:tc>
-          <w:tcPr>
-            <w:tcW w:type="dxa" w:w="2493"/>
-          </w:tcPr>
-          <w:p>
-            <w:r>
-              <w:t>—</w:t>
-            </w:r>
-          </w:p>
-        </w:tc>
-      </w:tr>
-      <w:tr>
-        <w:tc>
-          <w:tcPr>
-            <w:tcW w:type="dxa" w:w="2493"/>
-          </w:tcPr>
-          <w:p>
-            <w:r>
-              <w:t>TC-05-09</w:t>
-            </w:r>
-          </w:p>
-        </w:tc>
-        <w:tc>
-          <w:tcPr>
-            <w:tcW w:type="dxa" w:w="2493"/>
-          </w:tcPr>
-          <w:p>
-            <w:r>
-              <w:t>test_show_more_loads_additional_cards</w:t>
-            </w:r>
-          </w:p>
-        </w:tc>
-        <w:tc>
-          <w:tcPr>
-            <w:tcW w:type="dxa" w:w="2493"/>
-          </w:tcPr>
-          <w:p>
-            <w:r>
-              <w:t>FAIL</w:t>
-            </w:r>
-          </w:p>
-        </w:tc>
-        <w:tc>
-          <w:tcPr>
-            <w:tcW w:type="dxa" w:w="2493"/>
+            <w:tcW w:type="dxa" w:w="1995"/>
           </w:tcPr>
           <w:p>
             <w:r>
@@ -860,7 +558,423 @@
       <w:tr>
         <w:tc>
           <w:tcPr>
-            <w:tcW w:type="dxa" w:w="2493"/>
+            <w:tcW w:type="dxa" w:w="1995"/>
+          </w:tcPr>
+          <w:p>
+            <w:r>
+              <w:t>TC-05-02</w:t>
+            </w:r>
+          </w:p>
+        </w:tc>
+        <w:tc>
+          <w:tcPr>
+            <w:tcW w:type="dxa" w:w="1995"/>
+          </w:tcPr>
+          <w:p>
+            <w:r>
+              <w:t>test_news_section_loads</w:t>
+            </w:r>
+          </w:p>
+        </w:tc>
+        <w:tc>
+          <w:tcPr>
+            <w:tcW w:type="dxa" w:w="1995"/>
+          </w:tcPr>
+          <w:p>
+            <w:r>
+              <w:t>PASS</w:t>
+            </w:r>
+          </w:p>
+        </w:tc>
+        <w:tc>
+          <w:tcPr>
+            <w:tcW w:type="dxa" w:w="1995"/>
+          </w:tcPr>
+          <w:p>
+            <w:r>
+              <w:t>—</w:t>
+            </w:r>
+          </w:p>
+        </w:tc>
+        <w:tc>
+          <w:tcPr>
+            <w:tcW w:type="dxa" w:w="1995"/>
+          </w:tcPr>
+          <w:p>
+            <w:r>
+              <w:t>PASS</w:t>
+            </w:r>
+          </w:p>
+        </w:tc>
+      </w:tr>
+      <w:tr>
+        <w:tc>
+          <w:tcPr>
+            <w:tcW w:type="dxa" w:w="1995"/>
+          </w:tcPr>
+          <w:p>
+            <w:r>
+              <w:t>TC-05-03</w:t>
+            </w:r>
+          </w:p>
+        </w:tc>
+        <w:tc>
+          <w:tcPr>
+            <w:tcW w:type="dxa" w:w="1995"/>
+          </w:tcPr>
+          <w:p>
+            <w:r>
+              <w:t>test_news_heading_visible</w:t>
+            </w:r>
+          </w:p>
+        </w:tc>
+        <w:tc>
+          <w:tcPr>
+            <w:tcW w:type="dxa" w:w="1995"/>
+          </w:tcPr>
+          <w:p>
+            <w:r>
+              <w:t>PASS</w:t>
+            </w:r>
+          </w:p>
+        </w:tc>
+        <w:tc>
+          <w:tcPr>
+            <w:tcW w:type="dxa" w:w="1995"/>
+          </w:tcPr>
+          <w:p>
+            <w:r>
+              <w:t>—</w:t>
+            </w:r>
+          </w:p>
+        </w:tc>
+        <w:tc>
+          <w:tcPr>
+            <w:tcW w:type="dxa" w:w="1995"/>
+          </w:tcPr>
+          <w:p>
+            <w:r>
+              <w:t>PASS</w:t>
+            </w:r>
+          </w:p>
+        </w:tc>
+      </w:tr>
+      <w:tr>
+        <w:tc>
+          <w:tcPr>
+            <w:tcW w:type="dxa" w:w="1995"/>
+          </w:tcPr>
+          <w:p>
+            <w:r>
+              <w:t>TC-05-04</w:t>
+            </w:r>
+          </w:p>
+        </w:tc>
+        <w:tc>
+          <w:tcPr>
+            <w:tcW w:type="dxa" w:w="1995"/>
+          </w:tcPr>
+          <w:p>
+            <w:r>
+              <w:t>test_news_cards_have_meaningful_content</w:t>
+            </w:r>
+          </w:p>
+        </w:tc>
+        <w:tc>
+          <w:tcPr>
+            <w:tcW w:type="dxa" w:w="1995"/>
+          </w:tcPr>
+          <w:p>
+            <w:r>
+              <w:t>PASS</w:t>
+            </w:r>
+          </w:p>
+        </w:tc>
+        <w:tc>
+          <w:tcPr>
+            <w:tcW w:type="dxa" w:w="1995"/>
+          </w:tcPr>
+          <w:p>
+            <w:r>
+              <w:t>—</w:t>
+            </w:r>
+          </w:p>
+        </w:tc>
+        <w:tc>
+          <w:tcPr>
+            <w:tcW w:type="dxa" w:w="1995"/>
+          </w:tcPr>
+          <w:p>
+            <w:r>
+              <w:t>PASS</w:t>
+            </w:r>
+          </w:p>
+        </w:tc>
+      </w:tr>
+      <w:tr>
+        <w:tc>
+          <w:tcPr>
+            <w:tcW w:type="dxa" w:w="1995"/>
+          </w:tcPr>
+          <w:p>
+            <w:r>
+              <w:t>TC-05-05</w:t>
+            </w:r>
+          </w:p>
+        </w:tc>
+        <w:tc>
+          <w:tcPr>
+            <w:tcW w:type="dxa" w:w="1995"/>
+          </w:tcPr>
+          <w:p>
+            <w:r>
+              <w:t>test_news_cards_have_distinct_article_links</w:t>
+            </w:r>
+          </w:p>
+        </w:tc>
+        <w:tc>
+          <w:tcPr>
+            <w:tcW w:type="dxa" w:w="1995"/>
+          </w:tcPr>
+          <w:p>
+            <w:r>
+              <w:t>PASS</w:t>
+            </w:r>
+          </w:p>
+        </w:tc>
+        <w:tc>
+          <w:tcPr>
+            <w:tcW w:type="dxa" w:w="1995"/>
+          </w:tcPr>
+          <w:p>
+            <w:r>
+              <w:t>—</w:t>
+            </w:r>
+          </w:p>
+        </w:tc>
+        <w:tc>
+          <w:tcPr>
+            <w:tcW w:type="dxa" w:w="1995"/>
+          </w:tcPr>
+          <w:p>
+            <w:r>
+              <w:t>PASS</w:t>
+            </w:r>
+          </w:p>
+        </w:tc>
+      </w:tr>
+      <w:tr>
+        <w:tc>
+          <w:tcPr>
+            <w:tcW w:type="dxa" w:w="1995"/>
+          </w:tcPr>
+          <w:p>
+            <w:r>
+              <w:t>TC-05-06</w:t>
+            </w:r>
+          </w:p>
+        </w:tc>
+        <w:tc>
+          <w:tcPr>
+            <w:tcW w:type="dxa" w:w="1995"/>
+          </w:tcPr>
+          <w:p>
+            <w:r>
+              <w:t>test_open_article_from_card</w:t>
+            </w:r>
+          </w:p>
+        </w:tc>
+        <w:tc>
+          <w:tcPr>
+            <w:tcW w:type="dxa" w:w="1995"/>
+          </w:tcPr>
+          <w:p>
+            <w:r>
+              <w:t>PASS</w:t>
+            </w:r>
+          </w:p>
+        </w:tc>
+        <w:tc>
+          <w:tcPr>
+            <w:tcW w:type="dxa" w:w="1995"/>
+          </w:tcPr>
+          <w:p>
+            <w:r>
+              <w:t>—</w:t>
+            </w:r>
+          </w:p>
+        </w:tc>
+        <w:tc>
+          <w:tcPr>
+            <w:tcW w:type="dxa" w:w="1995"/>
+          </w:tcPr>
+          <w:p>
+            <w:r>
+              <w:t>PASS</w:t>
+            </w:r>
+          </w:p>
+        </w:tc>
+      </w:tr>
+      <w:tr>
+        <w:tc>
+          <w:tcPr>
+            <w:tcW w:type="dxa" w:w="1995"/>
+          </w:tcPr>
+          <w:p>
+            <w:r>
+              <w:t>TC-05-07</w:t>
+            </w:r>
+          </w:p>
+        </w:tc>
+        <w:tc>
+          <w:tcPr>
+            <w:tcW w:type="dxa" w:w="1995"/>
+          </w:tcPr>
+          <w:p>
+            <w:r>
+              <w:t>test_article_heading_and_details</w:t>
+            </w:r>
+          </w:p>
+        </w:tc>
+        <w:tc>
+          <w:tcPr>
+            <w:tcW w:type="dxa" w:w="1995"/>
+          </w:tcPr>
+          <w:p>
+            <w:r>
+              <w:t>PASS</w:t>
+            </w:r>
+          </w:p>
+        </w:tc>
+        <w:tc>
+          <w:tcPr>
+            <w:tcW w:type="dxa" w:w="1995"/>
+          </w:tcPr>
+          <w:p>
+            <w:r>
+              <w:t>—</w:t>
+            </w:r>
+          </w:p>
+        </w:tc>
+        <w:tc>
+          <w:tcPr>
+            <w:tcW w:type="dxa" w:w="1995"/>
+          </w:tcPr>
+          <w:p>
+            <w:r>
+              <w:t>PASS</w:t>
+            </w:r>
+          </w:p>
+        </w:tc>
+      </w:tr>
+      <w:tr>
+        <w:tc>
+          <w:tcPr>
+            <w:tcW w:type="dxa" w:w="1995"/>
+          </w:tcPr>
+          <w:p>
+            <w:r>
+              <w:t>TC-05-08</w:t>
+            </w:r>
+          </w:p>
+        </w:tc>
+        <w:tc>
+          <w:tcPr>
+            <w:tcW w:type="dxa" w:w="1995"/>
+          </w:tcPr>
+          <w:p>
+            <w:r>
+              <w:t>test_navigate_back_to_news_section</w:t>
+            </w:r>
+          </w:p>
+        </w:tc>
+        <w:tc>
+          <w:tcPr>
+            <w:tcW w:type="dxa" w:w="1995"/>
+          </w:tcPr>
+          <w:p>
+            <w:r>
+              <w:t>PASS</w:t>
+            </w:r>
+          </w:p>
+        </w:tc>
+        <w:tc>
+          <w:tcPr>
+            <w:tcW w:type="dxa" w:w="1995"/>
+          </w:tcPr>
+          <w:p>
+            <w:r>
+              <w:t>—</w:t>
+            </w:r>
+          </w:p>
+        </w:tc>
+        <w:tc>
+          <w:tcPr>
+            <w:tcW w:type="dxa" w:w="1995"/>
+          </w:tcPr>
+          <w:p>
+            <w:r>
+              <w:t>PASS</w:t>
+            </w:r>
+          </w:p>
+        </w:tc>
+      </w:tr>
+      <w:tr>
+        <w:tc>
+          <w:tcPr>
+            <w:tcW w:type="dxa" w:w="1995"/>
+          </w:tcPr>
+          <w:p>
+            <w:r>
+              <w:t>TC-05-09</w:t>
+            </w:r>
+          </w:p>
+        </w:tc>
+        <w:tc>
+          <w:tcPr>
+            <w:tcW w:type="dxa" w:w="1995"/>
+          </w:tcPr>
+          <w:p>
+            <w:r>
+              <w:t>test_show_more_loads_additional_cards</w:t>
+            </w:r>
+          </w:p>
+        </w:tc>
+        <w:tc>
+          <w:tcPr>
+            <w:tcW w:type="dxa" w:w="1995"/>
+          </w:tcPr>
+          <w:p>
+            <w:r>
+              <w:t>FAIL</w:t>
+            </w:r>
+          </w:p>
+        </w:tc>
+        <w:tc>
+          <w:tcPr>
+            <w:tcW w:type="dxa" w:w="1995"/>
+          </w:tcPr>
+          <w:p>
+            <w:r>
+              <w:t>PASS</w:t>
+            </w:r>
+          </w:p>
+        </w:tc>
+        <w:tc>
+          <w:tcPr>
+            <w:tcW w:type="dxa" w:w="1995"/>
+          </w:tcPr>
+          <w:p>
+            <w:r>
+              <w:t>PASS</w:t>
+            </w:r>
+          </w:p>
+        </w:tc>
+      </w:tr>
+      <w:tr>
+        <w:tc>
+          <w:tcPr>
+            <w:tcW w:type="dxa" w:w="1995"/>
           </w:tcPr>
           <w:p>
             <w:r>
@@ -870,7 +984,7 @@
         </w:tc>
         <w:tc>
           <w:tcPr>
-            <w:tcW w:type="dxa" w:w="2493"/>
+            <w:tcW w:type="dxa" w:w="1995"/>
           </w:tcPr>
           <w:p>
             <w:r>
@@ -880,7 +994,7 @@
         </w:tc>
         <w:tc>
           <w:tcPr>
-            <w:tcW w:type="dxa" w:w="2493"/>
+            <w:tcW w:type="dxa" w:w="1995"/>
           </w:tcPr>
           <w:p>
             <w:r>
@@ -890,11 +1004,21 @@
         </w:tc>
         <w:tc>
           <w:tcPr>
-            <w:tcW w:type="dxa" w:w="2493"/>
+            <w:tcW w:type="dxa" w:w="1995"/>
           </w:tcPr>
           <w:p>
             <w:r>
               <w:t>—</w:t>
+            </w:r>
+          </w:p>
+        </w:tc>
+        <w:tc>
+          <w:tcPr>
+            <w:tcW w:type="dxa" w:w="1995"/>
+          </w:tcPr>
+          <w:p>
+            <w:r>
+              <w:t>PASS</w:t>
             </w:r>
           </w:p>
         </w:tc>
@@ -935,7 +1059,7 @@
           <w:b w:val="0"/>
           <w:sz w:val="24"/>
         </w:rPr>
-        <w:t>Прогон №1 (полный, ~12:57): 9 PASS / 1 FAIL за 98.63 с, exit code 1.</w:t>
+        <w:t>Прогон №1 (полный, 2026-10-09 ~12:57): 9 PASS / 1 FAIL за 98.63 с, exit code 1.</w:t>
       </w:r>
     </w:p>
     <w:p>
@@ -987,7 +1111,7 @@
           <w:b w:val="0"/>
           <w:sz w:val="24"/>
         </w:rPr>
-        <w:t>Прогон №2 (только show_more, ~13:10): 1 PASS за 11.60 с, exit code 0.</w:t>
+        <w:t>Прогон №2 (только show_more, 2026-10-09 ~13:10): 1 PASS за 11.60 с, exit code 0.</w:t>
       </w:r>
     </w:p>
     <w:p>
@@ -1018,6 +1142,71 @@
     </w:p>
     <w:p>
       <w:pPr>
+        <w:spacing w:after="120" w:line="276" w:lineRule="auto"/>
+      </w:pPr>
+      <w:r>
+        <w:rPr>
+          <w:rFonts w:ascii="Times New Roman" w:hAnsi="Times New Roman" w:eastAsia="Times New Roman"/>
+          <w:b w:val="0"/>
+          <w:sz w:val="24"/>
+        </w:rPr>
+        <w:t>Прогон №3 (полный remediation, 2026-10-11 ~01:16): 10 PASS за 50.63 с, exit code 0.</w:t>
+      </w:r>
+    </w:p>
+    <w:p>
+      <w:pPr>
+        <w:spacing w:after="0" w:before="0"/>
+      </w:pPr>
+      <w:r>
+        <w:rPr>
+          <w:rFonts w:ascii="Consolas" w:hAnsi="Consolas" w:eastAsia="Consolas"/>
+          <w:b w:val="0"/>
+          <w:sz w:val="18"/>
+        </w:rPr>
+        <w:t>collected 10 items</w:t>
+      </w:r>
+    </w:p>
+    <w:p>
+      <w:pPr>
+        <w:spacing w:after="0" w:before="0"/>
+      </w:pPr>
+      <w:r>
+        <w:rPr>
+          <w:rFonts w:ascii="Consolas" w:hAnsi="Consolas" w:eastAsia="Consolas"/>
+          <w:b w:val="0"/>
+          <w:sz w:val="18"/>
+        </w:rPr>
+        <w:t>============================= 10 passed in 50.63s =============================</w:t>
+      </w:r>
+    </w:p>
+    <w:p>
+      <w:pPr>
+        <w:spacing w:after="0" w:before="0"/>
+      </w:pPr>
+      <w:r>
+        <w:rPr>
+          <w:rFonts w:ascii="Consolas" w:hAnsi="Consolas" w:eastAsia="Consolas"/>
+          <w:b w:val="0"/>
+          <w:sz w:val="18"/>
+        </w:rPr>
+        <w:t>JUnit: selenium/artifacts/kt05/junit_full_20261011_011634.xml</w:t>
+      </w:r>
+    </w:p>
+    <w:p>
+      <w:pPr>
+        <w:spacing w:after="0" w:before="0"/>
+      </w:pPr>
+      <w:r>
+        <w:rPr>
+          <w:rFonts w:ascii="Consolas" w:hAnsi="Consolas" w:eastAsia="Consolas"/>
+          <w:b w:val="0"/>
+          <w:sz w:val="18"/>
+        </w:rPr>
+        <w:t>HTML: selenium/artifacts/kt05/report_full_20261011_011634.html</w:t>
+      </w:r>
+    </w:p>
+    <w:p>
+      <w:pPr>
         <w:pStyle w:val="Heading1"/>
       </w:pPr>
       <w:r>
@@ -1026,7 +1215,7 @@
           <w:b/>
           <w:sz w:val="28"/>
         </w:rPr>
-        <w:t>8. Анализ FAIL и follow-up PASS</w:t>
+        <w:t>8. Анализ FAIL, follow-up и remediation</w:t>
       </w:r>
     </w:p>
     <w:p>
@@ -1052,7 +1241,7 @@
           <w:b w:val="0"/>
           <w:sz w:val="24"/>
         </w:rPr>
-        <w:t>Перед прогоном №2 Page Object уточнён: перепоиск кнопки; успех = больше карточек ИЛИ новые article links ИЛИ смена URL. Follow-up PASS и скриншот 10_after_show_more.png (расширенная лента) согласуются с исправлением теста.</w:t>
+        <w:t>Перед прогоном №2 Page Object уточнён: перепоиск кнопки; успех = больше карточек ИЛИ новые article links ИЛИ смена URL. Follow-up PASS и скриншот 10_after_show_more.png согласуются с исправлением теста.</w:t>
       </w:r>
     </w:p>
     <w:p>
@@ -1065,7 +1254,7 @@
           <w:b w:val="0"/>
           <w:sz w:val="24"/>
         </w:rPr>
-        <w:t>Остаточная неопределённость: полный suite с новым кодом заново не запускался, поэтому вклад кратковременной стабильности сайта/сети полностью не исключён. Дефект сайта не подтверждён. Итог не формулируется как «один прогон 10/10».</w:t>
+        <w:t>Прогон №3 подтвердил полный suite после fix: 10/10 PASS за 50.63 с. Дефект сайта не подтверждён. Исторические 9/1 и follow-up сохраняются как отдельные факты.</w:t>
       </w:r>
     </w:p>
     <w:p>
@@ -1192,7 +1381,7 @@
           <w:b w:val="0"/>
           <w:sz w:val="22"/>
         </w:rPr>
-        <w:t>Рисунок 1 — Главная VDNH (прогон №1)</w:t>
+        <w:t>Рисунок 1 — Главная VDNH (актуально после прогона №3)</w:t>
       </w:r>
     </w:p>
     <w:p>
@@ -1241,7 +1430,7 @@
           <w:b w:val="0"/>
           <w:sz w:val="22"/>
         </w:rPr>
-        <w:t>Рисунок 2 — Раздел /news/ (прогон №1)</w:t>
+        <w:t>Рисунок 2 — Раздел /news/</w:t>
       </w:r>
     </w:p>
     <w:p>
@@ -1257,56 +1446,7 @@
               <a:graphicData uri="http://schemas.openxmlformats.org/drawingml/2006/picture">
                 <pic:pic>
                   <pic:nvPicPr>
-                    <pic:cNvPr id="0" name="02_news_section_loaded.png"/>
-                    <pic:cNvPicPr/>
-                  </pic:nvPicPr>
-                  <pic:blipFill>
-                    <a:blip r:embed="rId10"/>
-                    <a:stretch>
-                      <a:fillRect/>
-                    </a:stretch>
-                  </pic:blipFill>
-                  <pic:spPr>
-                    <a:xfrm>
-                      <a:off x="0" y="0"/>
-                      <a:ext cx="5040000" cy="3091734"/>
-                    </a:xfrm>
-                    <a:prstGeom prst="rect"/>
-                  </pic:spPr>
-                </pic:pic>
-              </a:graphicData>
-            </a:graphic>
-          </wp:inline>
-        </w:drawing>
-      </w:r>
-    </w:p>
-    <w:p>
-      <w:pPr>
-        <w:jc w:val="center"/>
-      </w:pPr>
-      <w:r>
-        <w:rPr>
-          <w:rFonts w:ascii="Times New Roman" w:hAnsi="Times New Roman" w:eastAsia="Times New Roman"/>
-          <w:b w:val="0"/>
-          <w:sz w:val="22"/>
-        </w:rPr>
-        <w:t>Рисунок 3 — Карточки новостей (прогон №1)</w:t>
-      </w:r>
-    </w:p>
-    <w:p>
-      <w:r>
-        <w:drawing>
-          <wp:inline xmlns:a="http://schemas.openxmlformats.org/drawingml/2006/main" xmlns:pic="http://schemas.openxmlformats.org/drawingml/2006/picture">
-            <wp:extent cx="5040000" cy="3091734"/>
-            <wp:docPr id="4" name="Picture 4"/>
-            <wp:cNvGraphicFramePr>
-              <a:graphicFrameLocks noChangeAspect="1"/>
-            </wp:cNvGraphicFramePr>
-            <a:graphic>
-              <a:graphicData uri="http://schemas.openxmlformats.org/drawingml/2006/picture">
-                <pic:pic>
-                  <pic:nvPicPr>
-                    <pic:cNvPr id="0" name="06_article_opened.png"/>
+                    <pic:cNvPr id="0" name="04_news_cards.png"/>
                     <pic:cNvPicPr/>
                   </pic:nvPicPr>
                   <pic:blipFill>
@@ -1339,7 +1479,7 @@
           <w:b w:val="0"/>
           <w:sz w:val="22"/>
         </w:rPr>
-        <w:t>Рисунок 4 — Страница статьи (прогон №1)</w:t>
+        <w:t>Рисунок 3 — Карточки новостей</w:t>
       </w:r>
     </w:p>
     <w:p>
@@ -1347,7 +1487,7 @@
         <w:drawing>
           <wp:inline xmlns:a="http://schemas.openxmlformats.org/drawingml/2006/main" xmlns:pic="http://schemas.openxmlformats.org/drawingml/2006/picture">
             <wp:extent cx="5040000" cy="3091734"/>
-            <wp:docPr id="5" name="Picture 5"/>
+            <wp:docPr id="4" name="Picture 4"/>
             <wp:cNvGraphicFramePr>
               <a:graphicFrameLocks noChangeAspect="1"/>
             </wp:cNvGraphicFramePr>
@@ -1355,7 +1495,7 @@
               <a:graphicData uri="http://schemas.openxmlformats.org/drawingml/2006/picture">
                 <pic:pic>
                   <pic:nvPicPr>
-                    <pic:cNvPr id="0" name="08_back_to_news.png"/>
+                    <pic:cNvPr id="0" name="06_article_opened.png"/>
                     <pic:cNvPicPr/>
                   </pic:nvPicPr>
                   <pic:blipFill>
@@ -1388,7 +1528,7 @@
           <w:b w:val="0"/>
           <w:sz w:val="22"/>
         </w:rPr>
-        <w:t>Рисунок 5 — Возврат в новости (прогон №1)</w:t>
+        <w:t>Рисунок 4 — Страница статьи</w:t>
       </w:r>
     </w:p>
     <w:p>
@@ -1396,7 +1536,7 @@
         <w:drawing>
           <wp:inline xmlns:a="http://schemas.openxmlformats.org/drawingml/2006/main" xmlns:pic="http://schemas.openxmlformats.org/drawingml/2006/picture">
             <wp:extent cx="5040000" cy="3091734"/>
-            <wp:docPr id="6" name="Picture 6"/>
+            <wp:docPr id="5" name="Picture 5"/>
             <wp:cNvGraphicFramePr>
               <a:graphicFrameLocks noChangeAspect="1"/>
             </wp:cNvGraphicFramePr>
@@ -1404,56 +1544,7 @@
               <a:graphicData uri="http://schemas.openxmlformats.org/drawingml/2006/picture">
                 <pic:pic>
                   <pic:nvPicPr>
-                    <pic:cNvPr id="0" name="02_news_section_loaded.png"/>
-                    <pic:cNvPicPr/>
-                  </pic:nvPicPr>
-                  <pic:blipFill>
-                    <a:blip r:embed="rId10"/>
-                    <a:stretch>
-                      <a:fillRect/>
-                    </a:stretch>
-                  </pic:blipFill>
-                  <pic:spPr>
-                    <a:xfrm>
-                      <a:off x="0" y="0"/>
-                      <a:ext cx="5040000" cy="3091734"/>
-                    </a:xfrm>
-                    <a:prstGeom prst="rect"/>
-                  </pic:spPr>
-                </pic:pic>
-              </a:graphicData>
-            </a:graphic>
-          </wp:inline>
-        </w:drawing>
-      </w:r>
-    </w:p>
-    <w:p>
-      <w:pPr>
-        <w:jc w:val="center"/>
-      </w:pPr>
-      <w:r>
-        <w:rPr>
-          <w:rFonts w:ascii="Times New Roman" w:hAnsi="Times New Roman" w:eastAsia="Times New Roman"/>
-          <w:b w:val="0"/>
-          <w:sz w:val="22"/>
-        </w:rPr>
-        <w:t>Рисунок 6 — До «Показать еще» (прогон №1, затем FAIL)</w:t>
-      </w:r>
-    </w:p>
-    <w:p>
-      <w:r>
-        <w:drawing>
-          <wp:inline xmlns:a="http://schemas.openxmlformats.org/drawingml/2006/main" xmlns:pic="http://schemas.openxmlformats.org/drawingml/2006/picture">
-            <wp:extent cx="5040000" cy="3091734"/>
-            <wp:docPr id="7" name="Picture 7"/>
-            <wp:cNvGraphicFramePr>
-              <a:graphicFrameLocks noChangeAspect="1"/>
-            </wp:cNvGraphicFramePr>
-            <a:graphic>
-              <a:graphicData uri="http://schemas.openxmlformats.org/drawingml/2006/picture">
-                <pic:pic>
-                  <pic:nvPicPr>
-                    <pic:cNvPr id="0" name="10_after_show_more.png"/>
+                    <pic:cNvPr id="0" name="08_back_to_news.png"/>
                     <pic:cNvPicPr/>
                   </pic:nvPicPr>
                   <pic:blipFill>
@@ -1486,7 +1577,7 @@
           <w:b w:val="0"/>
           <w:sz w:val="22"/>
         </w:rPr>
-        <w:t>Рисунок 7 — После «Показать еще» (прогон №2, PASS)</w:t>
+        <w:t>Рисунок 5 — Возврат в новости</w:t>
       </w:r>
     </w:p>
     <w:p>
@@ -1494,7 +1585,7 @@
         <w:drawing>
           <wp:inline xmlns:a="http://schemas.openxmlformats.org/drawingml/2006/main" xmlns:pic="http://schemas.openxmlformats.org/drawingml/2006/picture">
             <wp:extent cx="5040000" cy="3091734"/>
-            <wp:docPr id="8" name="Picture 8"/>
+            <wp:docPr id="6" name="Picture 6"/>
             <wp:cNvGraphicFramePr>
               <a:graphicFrameLocks noChangeAspect="1"/>
             </wp:cNvGraphicFramePr>
@@ -1506,7 +1597,7 @@
                     <pic:cNvPicPr/>
                   </pic:nvPicPr>
                   <pic:blipFill>
-                    <a:blip r:embed="rId12"/>
+                    <a:blip r:embed="rId13"/>
                     <a:stretch>
                       <a:fillRect/>
                     </a:stretch>
@@ -1535,7 +1626,105 @@
           <w:b w:val="0"/>
           <w:sz w:val="22"/>
         </w:rPr>
-        <w:t>Рисунок 8 — Навигация меню (прогон №1)</w:t>
+        <w:t>Рисунок 6 — До «Показать еще»</w:t>
+      </w:r>
+    </w:p>
+    <w:p>
+      <w:r>
+        <w:drawing>
+          <wp:inline xmlns:a="http://schemas.openxmlformats.org/drawingml/2006/main" xmlns:pic="http://schemas.openxmlformats.org/drawingml/2006/picture">
+            <wp:extent cx="5040000" cy="3091734"/>
+            <wp:docPr id="7" name="Picture 7"/>
+            <wp:cNvGraphicFramePr>
+              <a:graphicFrameLocks noChangeAspect="1"/>
+            </wp:cNvGraphicFramePr>
+            <a:graphic>
+              <a:graphicData uri="http://schemas.openxmlformats.org/drawingml/2006/picture">
+                <pic:pic>
+                  <pic:nvPicPr>
+                    <pic:cNvPr id="0" name="10_after_show_more.png"/>
+                    <pic:cNvPicPr/>
+                  </pic:nvPicPr>
+                  <pic:blipFill>
+                    <a:blip r:embed="rId14"/>
+                    <a:stretch>
+                      <a:fillRect/>
+                    </a:stretch>
+                  </pic:blipFill>
+                  <pic:spPr>
+                    <a:xfrm>
+                      <a:off x="0" y="0"/>
+                      <a:ext cx="5040000" cy="3091734"/>
+                    </a:xfrm>
+                    <a:prstGeom prst="rect"/>
+                  </pic:spPr>
+                </pic:pic>
+              </a:graphicData>
+            </a:graphic>
+          </wp:inline>
+        </w:drawing>
+      </w:r>
+    </w:p>
+    <w:p>
+      <w:pPr>
+        <w:jc w:val="center"/>
+      </w:pPr>
+      <w:r>
+        <w:rPr>
+          <w:rFonts w:ascii="Times New Roman" w:hAnsi="Times New Roman" w:eastAsia="Times New Roman"/>
+          <w:b w:val="0"/>
+          <w:sz w:val="22"/>
+        </w:rPr>
+        <w:t>Рисунок 7 — После «Показать еще»</w:t>
+      </w:r>
+    </w:p>
+    <w:p>
+      <w:r>
+        <w:drawing>
+          <wp:inline xmlns:a="http://schemas.openxmlformats.org/drawingml/2006/main" xmlns:pic="http://schemas.openxmlformats.org/drawingml/2006/picture">
+            <wp:extent cx="5040000" cy="3091734"/>
+            <wp:docPr id="8" name="Picture 8"/>
+            <wp:cNvGraphicFramePr>
+              <a:graphicFrameLocks noChangeAspect="1"/>
+            </wp:cNvGraphicFramePr>
+            <a:graphic>
+              <a:graphicData uri="http://schemas.openxmlformats.org/drawingml/2006/picture">
+                <pic:pic>
+                  <pic:nvPicPr>
+                    <pic:cNvPr id="0" name="08_back_to_news.png"/>
+                    <pic:cNvPicPr/>
+                  </pic:nvPicPr>
+                  <pic:blipFill>
+                    <a:blip r:embed="rId13"/>
+                    <a:stretch>
+                      <a:fillRect/>
+                    </a:stretch>
+                  </pic:blipFill>
+                  <pic:spPr>
+                    <a:xfrm>
+                      <a:off x="0" y="0"/>
+                      <a:ext cx="5040000" cy="3091734"/>
+                    </a:xfrm>
+                    <a:prstGeom prst="rect"/>
+                  </pic:spPr>
+                </pic:pic>
+              </a:graphicData>
+            </a:graphic>
+          </wp:inline>
+        </w:drawing>
+      </w:r>
+    </w:p>
+    <w:p>
+      <w:pPr>
+        <w:jc w:val="center"/>
+      </w:pPr>
+      <w:r>
+        <w:rPr>
+          <w:rFonts w:ascii="Times New Roman" w:hAnsi="Times New Roman" w:eastAsia="Times New Roman"/>
+          <w:b w:val="0"/>
+          <w:sz w:val="22"/>
+        </w:rPr>
+        <w:t>Рисунок 8 — Навигация меню</w:t>
       </w:r>
     </w:p>
     <w:p>
@@ -1574,7 +1763,7 @@
           <w:b w:val="0"/>
           <w:sz w:val="24"/>
         </w:rPr>
-        <w:t>Процесс: не склеивать полный и follow-up прогоны; составные условия успеха подгрузки; data-testid на динамических кнопках желательны на стороне сайта; локаторы перепроверять при смене вёрстки. См. docs/kt05/recommendations.md.</w:t>
+        <w:t>Процесс: не склеивать исторический полный и follow-up прогоны; составные условия успеха подгрузки; data-testid на динамических кнопках желательны на стороне сайта; локаторы перепроверять при смене вёрстки. См. docs/kt05/recommendations.md.</w:t>
       </w:r>
     </w:p>
     <w:p>
@@ -1600,7 +1789,7 @@
           <w:b w:val="0"/>
           <w:sz w:val="24"/>
         </w:rPr>
-        <w:t>КТ 05: 10 функциональных автотестов на https://vdnh.ru/news/, Page Object, расширенная документация (выбор сайта, методика, дефекты, рекомендации). Полный прогон: 9 PASS / 1 FAIL. Show_more подтверждён отдельно PASS (11.60 с). Единого прогона 10/10 не было. Дефект сайта не подтверждён.</w:t>
+        <w:t>КТ 05: 10 функциональных автотестов на https://vdnh.ru/news/, Page Object, расширенная документация (выбор сайта, методика, дефекты, рекомендации). История: полный прогон 9 PASS / 1 FAIL; show_more отдельно PASS (11.60 с). Remediation 2026-10-11: полный suite 10 passed in 50.63s. Дефект сайта не подтверждён. White-box backend не применим.</w:t>
       </w:r>
     </w:p>
     <w:sectPr>

</xml_diff>